<commit_message>
Creación de casos de uso
</commit_message>
<xml_diff>
--- a/Casos de Uso/CU-00-Portal de Inicio v1.docx
+++ b/Casos de Uso/CU-00-Portal de Inicio v1.docx
@@ -1014,21 +1014,15 @@
         <w:spacing w:line="360" w:lineRule="auto"/>
         <w:ind w:right="300"/>
         <w:rPr>
-          <w:rFonts w:ascii="Arial" w:hAnsi="Arial" w:cs="Arial"/>
           <w:b/>
           <w:bCs/>
-          <w:sz w:val="27"/>
-          <w:szCs w:val="27"/>
           <w:lang w:val="es-ES_tradnl"/>
         </w:rPr>
       </w:pPr>
       <w:r>
         <w:rPr>
-          <w:rFonts w:ascii="Arial" w:hAnsi="Arial" w:cs="Arial"/>
           <w:b/>
           <w:bCs/>
-          <w:sz w:val="27"/>
-          <w:szCs w:val="27"/>
           <w:lang w:val="es-ES_tradnl"/>
         </w:rPr>
         <w:lastRenderedPageBreak/>
@@ -1045,21 +1039,15 @@
         <w:spacing w:line="360" w:lineRule="auto"/>
         <w:ind w:right="300"/>
         <w:rPr>
-          <w:rFonts w:ascii="Arial" w:hAnsi="Arial" w:cs="Arial"/>
           <w:b/>
           <w:bCs/>
-          <w:sz w:val="27"/>
-          <w:szCs w:val="27"/>
           <w:lang w:val="es-ES_tradnl"/>
         </w:rPr>
       </w:pPr>
       <w:r>
         <w:rPr>
-          <w:rFonts w:ascii="Arial" w:hAnsi="Arial" w:cs="Arial"/>
           <w:b/>
           <w:bCs/>
-          <w:sz w:val="27"/>
-          <w:szCs w:val="27"/>
           <w:lang w:val="es-ES_tradnl"/>
         </w:rPr>
         <w:t>Objetivo</w:t>
@@ -1071,59 +1059,41 @@
         <w:spacing w:before="0" w:beforeAutospacing="0" w:after="120" w:afterAutospacing="0" w:line="360" w:lineRule="auto"/>
         <w:ind w:left="357" w:right="301"/>
         <w:rPr>
-          <w:rFonts w:ascii="Arial" w:hAnsi="Arial" w:cs="Arial"/>
-          <w:noProof/>
-          <w:sz w:val="20"/>
-          <w:szCs w:val="20"/>
-          <w:lang w:val="es-GT"/>
-        </w:rPr>
-      </w:pPr>
-      <w:r>
-        <w:rPr>
-          <w:rFonts w:ascii="Arial" w:hAnsi="Arial" w:cs="Arial"/>
-          <w:noProof/>
-          <w:sz w:val="20"/>
-          <w:szCs w:val="20"/>
+          <w:noProof/>
+          <w:lang w:val="es-GT"/>
+        </w:rPr>
+      </w:pPr>
+      <w:r>
+        <w:rPr>
+          <w:noProof/>
           <w:lang w:val="es-GT"/>
         </w:rPr>
         <w:t xml:space="preserve">Permitir que cualquier ciudadano acceda al portal web de la Municipalidad de Granados B.V para conocer la información institucional, donde el ciudadano podrá </w:t>
       </w:r>
       <w:r>
         <w:rPr>
-          <w:rFonts w:ascii="Arial" w:hAnsi="Arial" w:cs="Arial"/>
-          <w:noProof/>
-          <w:sz w:val="20"/>
-          <w:szCs w:val="20"/>
+          <w:noProof/>
           <w:lang w:val="es-GT"/>
         </w:rPr>
         <w:t>realizar el</w:t>
       </w:r>
       <w:r>
         <w:rPr>
-          <w:rFonts w:ascii="Arial" w:hAnsi="Arial" w:cs="Arial"/>
-          <w:noProof/>
-          <w:sz w:val="20"/>
-          <w:szCs w:val="20"/>
+          <w:noProof/>
           <w:lang w:val="es-GT"/>
         </w:rPr>
         <w:t xml:space="preserve"> registro de una queja, sugerencia o denuncia, permitiendo así mismo a</w:t>
       </w:r>
       <w:r>
         <w:rPr>
-          <w:rFonts w:ascii="Arial" w:hAnsi="Arial" w:cs="Arial"/>
-          <w:noProof/>
-          <w:sz w:val="20"/>
-          <w:szCs w:val="20"/>
+          <w:noProof/>
           <w:lang w:val="es-GT"/>
         </w:rPr>
         <w:t>l</w:t>
       </w:r>
       <w:r>
         <w:rPr>
-          <w:rFonts w:ascii="Arial" w:hAnsi="Arial" w:cs="Arial"/>
-          <w:noProof/>
-          <w:sz w:val="20"/>
-          <w:szCs w:val="20"/>
+          <w:noProof/>
           <w:lang w:val="es-GT"/>
         </w:rPr>
         <w:t xml:space="preserve"> personal municipal acceder al sistema mediante autenticación.</w:t>
@@ -1139,22 +1109,16 @@
         <w:spacing w:line="360" w:lineRule="auto"/>
         <w:ind w:right="300"/>
         <w:rPr>
-          <w:rFonts w:ascii="Arial" w:hAnsi="Arial" w:cs="Arial"/>
           <w:b/>
           <w:bCs/>
-          <w:sz w:val="27"/>
-          <w:szCs w:val="27"/>
           <w:lang w:val="es-ES_tradnl"/>
         </w:rPr>
       </w:pPr>
       <w:bookmarkStart w:id="0" w:name="1"/>
       <w:r>
         <w:rPr>
-          <w:rFonts w:ascii="Arial" w:hAnsi="Arial" w:cs="Arial"/>
           <w:b/>
           <w:bCs/>
-          <w:sz w:val="27"/>
-          <w:szCs w:val="27"/>
           <w:lang w:val="es-ES_tradnl"/>
         </w:rPr>
         <w:t>Definición Caso de Uso</w:t>
@@ -1170,21 +1134,15 @@
         <w:spacing w:line="360" w:lineRule="auto"/>
         <w:ind w:right="300"/>
         <w:rPr>
-          <w:rFonts w:ascii="Arial" w:hAnsi="Arial" w:cs="Arial"/>
           <w:b/>
           <w:bCs/>
-          <w:sz w:val="27"/>
-          <w:szCs w:val="27"/>
           <w:lang w:val="es-ES_tradnl"/>
         </w:rPr>
       </w:pPr>
       <w:r>
         <w:rPr>
-          <w:rFonts w:ascii="Arial" w:hAnsi="Arial" w:cs="Arial"/>
           <w:b/>
           <w:bCs/>
-          <w:sz w:val="27"/>
-          <w:szCs w:val="27"/>
           <w:lang w:val="es-ES_tradnl"/>
         </w:rPr>
         <w:t>Actores</w:t>
@@ -1200,21 +1158,15 @@
         <w:spacing w:line="360" w:lineRule="auto"/>
         <w:jc w:val="both"/>
         <w:rPr>
-          <w:rFonts w:ascii="Arial" w:hAnsi="Arial" w:cs="Arial"/>
           <w:iCs/>
           <w:noProof/>
-          <w:sz w:val="20"/>
-          <w:szCs w:val="20"/>
           <w:lang w:val="es-ES_tradnl"/>
         </w:rPr>
       </w:pPr>
       <w:r>
         <w:rPr>
-          <w:rFonts w:ascii="Arial" w:hAnsi="Arial" w:cs="Arial"/>
           <w:iCs/>
           <w:noProof/>
-          <w:sz w:val="20"/>
-          <w:szCs w:val="20"/>
           <w:lang w:val="es-ES_tradnl"/>
         </w:rPr>
         <w:t>Cuidadano</w:t>
@@ -1230,21 +1182,15 @@
         <w:spacing w:line="360" w:lineRule="auto"/>
         <w:jc w:val="both"/>
         <w:rPr>
-          <w:rFonts w:ascii="Arial" w:hAnsi="Arial" w:cs="Arial"/>
           <w:iCs/>
           <w:noProof/>
-          <w:sz w:val="20"/>
-          <w:szCs w:val="20"/>
           <w:lang w:val="es-ES_tradnl"/>
         </w:rPr>
       </w:pPr>
       <w:r>
         <w:rPr>
-          <w:rFonts w:ascii="Arial" w:hAnsi="Arial" w:cs="Arial"/>
           <w:iCs/>
           <w:noProof/>
-          <w:sz w:val="20"/>
-          <w:szCs w:val="20"/>
           <w:lang w:val="es-ES_tradnl"/>
         </w:rPr>
         <w:t>Empleado municipal</w:t>
@@ -1260,21 +1206,15 @@
         <w:spacing w:line="360" w:lineRule="auto"/>
         <w:jc w:val="both"/>
         <w:rPr>
-          <w:rFonts w:ascii="Arial" w:hAnsi="Arial" w:cs="Arial"/>
           <w:iCs/>
           <w:noProof/>
-          <w:sz w:val="20"/>
-          <w:szCs w:val="20"/>
-          <w:lang w:val="es-GT"/>
-        </w:rPr>
-      </w:pPr>
-      <w:r>
-        <w:rPr>
-          <w:rFonts w:ascii="Arial" w:hAnsi="Arial" w:cs="Arial"/>
+          <w:lang w:val="es-GT"/>
+        </w:rPr>
+      </w:pPr>
+      <w:r>
+        <w:rPr>
           <w:iCs/>
           <w:noProof/>
-          <w:sz w:val="20"/>
-          <w:szCs w:val="20"/>
           <w:lang w:val="es-ES_tradnl"/>
         </w:rPr>
         <w:t>Sistema web</w:t>
@@ -1290,21 +1230,15 @@
         <w:spacing w:line="360" w:lineRule="auto"/>
         <w:ind w:right="300"/>
         <w:rPr>
-          <w:rFonts w:ascii="Arial" w:hAnsi="Arial" w:cs="Arial"/>
           <w:b/>
           <w:bCs/>
-          <w:sz w:val="27"/>
-          <w:szCs w:val="27"/>
           <w:lang w:val="es-ES_tradnl"/>
         </w:rPr>
       </w:pPr>
       <w:r>
         <w:rPr>
-          <w:rFonts w:ascii="Arial" w:hAnsi="Arial" w:cs="Arial"/>
           <w:b/>
           <w:bCs/>
-          <w:sz w:val="27"/>
-          <w:szCs w:val="27"/>
           <w:lang w:val="es-ES_tradnl"/>
         </w:rPr>
         <w:t>Precondiciones</w:t>
@@ -1320,52 +1254,16 @@
         <w:spacing w:line="360" w:lineRule="auto"/>
         <w:ind w:left="1225" w:hanging="505"/>
         <w:rPr>
-          <w:rFonts w:ascii="Arial" w:hAnsi="Arial" w:cs="Arial"/>
           <w:iCs/>
           <w:noProof/>
-          <w:sz w:val="20"/>
-          <w:szCs w:val="20"/>
-        </w:rPr>
-      </w:pPr>
-      <w:r>
-        <w:rPr>
-          <w:rFonts w:ascii="Arial" w:hAnsi="Arial" w:cs="Arial"/>
+        </w:rPr>
+      </w:pPr>
+      <w:r>
+        <w:rPr>
           <w:iCs/>
           <w:noProof/>
-          <w:sz w:val="20"/>
-          <w:szCs w:val="20"/>
-        </w:rPr>
-        <w:t>Que e</w:t>
-      </w:r>
-      <w:r>
-        <w:rPr>
-          <w:rFonts w:ascii="Arial" w:hAnsi="Arial" w:cs="Arial"/>
-          <w:iCs/>
-          <w:noProof/>
-          <w:sz w:val="20"/>
-          <w:szCs w:val="20"/>
-        </w:rPr>
-        <w:t xml:space="preserve">l sistema web se </w:t>
-      </w:r>
-      <w:r>
-        <w:rPr>
-          <w:rFonts w:ascii="Arial" w:hAnsi="Arial" w:cs="Arial"/>
-          <w:iCs/>
-          <w:noProof/>
-          <w:sz w:val="20"/>
-          <w:szCs w:val="20"/>
-        </w:rPr>
-        <w:t xml:space="preserve">encuentre </w:t>
-      </w:r>
-      <w:r>
-        <w:rPr>
-          <w:rFonts w:ascii="Arial" w:hAnsi="Arial" w:cs="Arial"/>
-          <w:iCs/>
-          <w:noProof/>
-          <w:sz w:val="20"/>
-          <w:szCs w:val="20"/>
-        </w:rPr>
-        <w:t>disponible.</w:t>
+        </w:rPr>
+        <w:t>Que el sistema web se encuentre disponible.</w:t>
       </w:r>
     </w:p>
     <w:p>
@@ -1378,18 +1276,12 @@
         <w:spacing w:line="360" w:lineRule="auto"/>
         <w:ind w:left="1225" w:hanging="505"/>
         <w:rPr>
-          <w:rFonts w:ascii="Arial" w:hAnsi="Arial" w:cs="Arial"/>
-          <w:noProof/>
-          <w:sz w:val="20"/>
-          <w:szCs w:val="20"/>
-        </w:rPr>
-      </w:pPr>
-      <w:r>
-        <w:rPr>
-          <w:rFonts w:ascii="Arial" w:hAnsi="Arial" w:cs="Arial"/>
-          <w:noProof/>
-          <w:sz w:val="20"/>
-          <w:szCs w:val="20"/>
+          <w:noProof/>
+        </w:rPr>
+      </w:pPr>
+      <w:r>
+        <w:rPr>
+          <w:noProof/>
         </w:rPr>
         <w:t>Que el usuario y empleado municipal dispongan de acceso a internet y cuenten con credenciales para acceder.</w:t>
       </w:r>
@@ -1404,21 +1296,15 @@
         <w:spacing w:line="360" w:lineRule="auto"/>
         <w:ind w:right="300"/>
         <w:rPr>
-          <w:rFonts w:ascii="Arial" w:hAnsi="Arial" w:cs="Arial"/>
           <w:b/>
           <w:bCs/>
-          <w:sz w:val="27"/>
-          <w:szCs w:val="27"/>
           <w:lang w:val="es-ES_tradnl"/>
         </w:rPr>
       </w:pPr>
       <w:r>
         <w:rPr>
-          <w:rFonts w:ascii="Arial" w:hAnsi="Arial" w:cs="Arial"/>
           <w:b/>
           <w:bCs/>
-          <w:sz w:val="27"/>
-          <w:szCs w:val="27"/>
         </w:rPr>
         <w:t xml:space="preserve">Flujo Normal Básico </w:t>
       </w:r>
@@ -1433,35 +1319,18 @@
         <w:spacing w:line="360" w:lineRule="auto"/>
         <w:jc w:val="both"/>
         <w:rPr>
-          <w:rFonts w:ascii="Arial" w:hAnsi="Arial" w:cs="Arial"/>
           <w:iCs/>
           <w:noProof/>
-          <w:sz w:val="20"/>
-          <w:szCs w:val="20"/>
           <w:lang w:val="es-ES_tradnl"/>
         </w:rPr>
       </w:pPr>
       <w:r>
         <w:rPr>
-          <w:rFonts w:ascii="Arial" w:hAnsi="Arial" w:cs="Arial"/>
           <w:iCs/>
           <w:noProof/>
-          <w:sz w:val="20"/>
-          <w:szCs w:val="20"/>
           <w:lang w:val="es-ES_tradnl"/>
         </w:rPr>
-        <w:t>El sistema muestra el portal de inicio. FA01</w:t>
-      </w:r>
-      <w:r>
-        <w:rPr>
-          <w:rFonts w:ascii="Arial" w:hAnsi="Arial" w:cs="Arial"/>
-          <w:iCs/>
-          <w:noProof/>
-          <w:sz w:val="20"/>
-          <w:szCs w:val="20"/>
-          <w:lang w:val="es-ES_tradnl"/>
-        </w:rPr>
-        <w:t>, FA02</w:t>
+        <w:t>El sistema muestra el portal de inicio. FA01, FA02</w:t>
       </w:r>
     </w:p>
     <w:p>
@@ -1474,21 +1343,33 @@
         <w:spacing w:line="360" w:lineRule="auto"/>
         <w:jc w:val="both"/>
         <w:rPr>
-          <w:rFonts w:ascii="Arial" w:hAnsi="Arial" w:cs="Arial"/>
-          <w:noProof/>
-          <w:sz w:val="20"/>
-          <w:szCs w:val="20"/>
-          <w:lang w:val="es-GT"/>
-        </w:rPr>
-      </w:pPr>
-      <w:r>
-        <w:rPr>
-          <w:rFonts w:ascii="Arial" w:hAnsi="Arial" w:cs="Arial"/>
-          <w:noProof/>
-          <w:sz w:val="20"/>
-          <w:szCs w:val="20"/>
-        </w:rPr>
-        <w:t>El ciudadano seleciona el botón “Ingresa tu queja”. CU-02, FA03, FA04</w:t>
+          <w:noProof/>
+          <w:lang w:val="es-GT"/>
+        </w:rPr>
+      </w:pPr>
+      <w:r>
+        <w:rPr>
+          <w:noProof/>
+        </w:rPr>
+        <w:t>El ciudadano seleciona el botón “</w:t>
+      </w:r>
+      <w:r>
+        <w:rPr>
+          <w:noProof/>
+        </w:rPr>
+        <w:t>Registrar Queja</w:t>
+      </w:r>
+      <w:r>
+        <w:rPr>
+          <w:noProof/>
+        </w:rPr>
+        <w:t>”. FA03, FA04</w:t>
+      </w:r>
+      <w:r>
+        <w:rPr>
+          <w:noProof/>
+        </w:rPr>
+        <w:t>, FA05</w:t>
       </w:r>
     </w:p>
     <w:p>
@@ -1501,19 +1382,13 @@
         <w:spacing w:line="360" w:lineRule="auto"/>
         <w:jc w:val="both"/>
         <w:rPr>
-          <w:rFonts w:ascii="Arial" w:hAnsi="Arial" w:cs="Arial"/>
-          <w:noProof/>
-          <w:sz w:val="20"/>
-          <w:szCs w:val="20"/>
-          <w:lang w:val="es-GT"/>
-        </w:rPr>
-      </w:pPr>
-      <w:r>
-        <w:rPr>
-          <w:rFonts w:ascii="Arial" w:hAnsi="Arial" w:cs="Arial"/>
-          <w:noProof/>
-          <w:sz w:val="20"/>
-          <w:szCs w:val="20"/>
+          <w:noProof/>
+          <w:lang w:val="es-GT"/>
+        </w:rPr>
+      </w:pPr>
+      <w:r>
+        <w:rPr>
+          <w:noProof/>
         </w:rPr>
         <w:t>Fin del caso de uso</w:t>
       </w:r>
@@ -1528,21 +1403,15 @@
         <w:spacing w:line="360" w:lineRule="auto"/>
         <w:ind w:right="300"/>
         <w:rPr>
-          <w:rFonts w:ascii="Arial" w:hAnsi="Arial" w:cs="Arial"/>
           <w:b/>
           <w:bCs/>
-          <w:sz w:val="27"/>
-          <w:szCs w:val="27"/>
           <w:lang w:val="es-ES_tradnl"/>
         </w:rPr>
       </w:pPr>
       <w:r>
         <w:rPr>
-          <w:rFonts w:ascii="Arial" w:hAnsi="Arial" w:cs="Arial"/>
           <w:b/>
           <w:bCs/>
-          <w:sz w:val="27"/>
-          <w:szCs w:val="27"/>
           <w:lang w:val="es-ES_tradnl"/>
         </w:rPr>
         <w:t>Flujos Alternos.</w:t>
@@ -1554,22 +1423,16 @@
         <w:ind w:left="360"/>
         <w:jc w:val="both"/>
         <w:rPr>
-          <w:rFonts w:ascii="Arial" w:hAnsi="Arial" w:cs="Arial"/>
           <w:iCs/>
           <w:noProof/>
-          <w:sz w:val="20"/>
-          <w:szCs w:val="20"/>
-          <w:lang w:val="es-GT"/>
-        </w:rPr>
-      </w:pPr>
-      <w:r>
-        <w:rPr>
-          <w:rFonts w:ascii="Arial" w:hAnsi="Arial" w:cs="Arial"/>
+          <w:lang w:val="es-GT"/>
+        </w:rPr>
+      </w:pPr>
+      <w:r>
+        <w:rPr>
           <w:b/>
           <w:bCs/>
           <w:noProof/>
-          <w:sz w:val="20"/>
-          <w:szCs w:val="20"/>
           <w:lang w:val="es-GT"/>
         </w:rPr>
         <w:t>FA01: Portal de inicio</w:t>
@@ -1584,19 +1447,13 @@
         </w:numPr>
         <w:jc w:val="both"/>
         <w:rPr>
-          <w:rFonts w:ascii="Arial" w:hAnsi="Arial" w:cs="Arial"/>
-          <w:noProof/>
-          <w:sz w:val="20"/>
-          <w:szCs w:val="20"/>
-          <w:lang w:val="es-GT"/>
-        </w:rPr>
-      </w:pPr>
-      <w:r>
-        <w:rPr>
-          <w:rFonts w:ascii="Arial" w:hAnsi="Arial" w:cs="Arial"/>
-          <w:noProof/>
-          <w:sz w:val="20"/>
-          <w:szCs w:val="20"/>
+          <w:noProof/>
+          <w:lang w:val="es-GT"/>
+        </w:rPr>
+      </w:pPr>
+      <w:r>
+        <w:rPr>
+          <w:noProof/>
           <w:lang w:val="es-GT"/>
         </w:rPr>
         <w:t xml:space="preserve">El sistema muestra la visión de la municipalidad. </w:t>
@@ -1611,19 +1468,13 @@
         </w:numPr>
         <w:jc w:val="both"/>
         <w:rPr>
-          <w:rFonts w:ascii="Arial" w:hAnsi="Arial" w:cs="Arial"/>
-          <w:noProof/>
-          <w:sz w:val="20"/>
-          <w:szCs w:val="20"/>
-          <w:lang w:val="es-GT"/>
-        </w:rPr>
-      </w:pPr>
-      <w:r>
-        <w:rPr>
-          <w:rFonts w:ascii="Arial" w:hAnsi="Arial" w:cs="Arial"/>
-          <w:noProof/>
-          <w:sz w:val="20"/>
-          <w:szCs w:val="20"/>
+          <w:noProof/>
+          <w:lang w:val="es-GT"/>
+        </w:rPr>
+      </w:pPr>
+      <w:r>
+        <w:rPr>
+          <w:noProof/>
           <w:lang w:val="es-GT"/>
         </w:rPr>
         <w:t xml:space="preserve">El sistema muestra la misión de la municipalidad. </w:t>
@@ -1638,19 +1489,13 @@
         </w:numPr>
         <w:jc w:val="both"/>
         <w:rPr>
-          <w:rFonts w:ascii="Arial" w:hAnsi="Arial" w:cs="Arial"/>
-          <w:noProof/>
-          <w:sz w:val="20"/>
-          <w:szCs w:val="20"/>
-          <w:lang w:val="es-GT"/>
-        </w:rPr>
-      </w:pPr>
-      <w:r>
-        <w:rPr>
-          <w:rFonts w:ascii="Arial" w:hAnsi="Arial" w:cs="Arial"/>
-          <w:noProof/>
-          <w:sz w:val="20"/>
-          <w:szCs w:val="20"/>
+          <w:noProof/>
+          <w:lang w:val="es-GT"/>
+        </w:rPr>
+      </w:pPr>
+      <w:r>
+        <w:rPr>
+          <w:noProof/>
           <w:lang w:val="es-GT"/>
         </w:rPr>
         <w:t>Fin del caso de uso</w:t>
@@ -1662,10 +1507,7 @@
         <w:ind w:left="1080"/>
         <w:jc w:val="both"/>
         <w:rPr>
-          <w:rFonts w:ascii="Arial" w:hAnsi="Arial" w:cs="Arial"/>
-          <w:noProof/>
-          <w:sz w:val="20"/>
-          <w:szCs w:val="20"/>
+          <w:noProof/>
           <w:lang w:val="es-GT"/>
         </w:rPr>
       </w:pPr>
@@ -1676,54 +1518,22 @@
         <w:ind w:left="360"/>
         <w:jc w:val="both"/>
         <w:rPr>
-          <w:rFonts w:ascii="Arial" w:hAnsi="Arial" w:cs="Arial"/>
           <w:b/>
           <w:bCs/>
           <w:iCs/>
           <w:noProof/>
-          <w:sz w:val="20"/>
-          <w:szCs w:val="20"/>
-          <w:lang w:val="es-GT"/>
-        </w:rPr>
-      </w:pPr>
-      <w:r>
-        <w:rPr>
-          <w:rFonts w:ascii="Arial" w:hAnsi="Arial" w:cs="Arial"/>
+          <w:lang w:val="es-GT"/>
+        </w:rPr>
+      </w:pPr>
+      <w:r>
+        <w:rPr>
           <w:b/>
           <w:bCs/>
           <w:iCs/>
           <w:noProof/>
-          <w:sz w:val="20"/>
-          <w:szCs w:val="20"/>
-          <w:lang w:val="es-GT"/>
-        </w:rPr>
-        <w:t>FA02: Portal</w:t>
-      </w:r>
-      <w:r>
-        <w:rPr>
-          <w:rFonts w:ascii="Arial" w:hAnsi="Arial" w:cs="Arial"/>
-          <w:b/>
-          <w:bCs/>
-          <w:iCs/>
-          <w:noProof/>
-          <w:sz w:val="20"/>
-          <w:szCs w:val="20"/>
-          <w:lang w:val="es-GT"/>
-        </w:rPr>
-        <w:t xml:space="preserve"> de inicio</w:t>
-      </w:r>
-      <w:r>
-        <w:rPr>
-          <w:rFonts w:ascii="Arial" w:hAnsi="Arial" w:cs="Arial"/>
-          <w:b/>
-          <w:bCs/>
-          <w:iCs/>
-          <w:noProof/>
-          <w:sz w:val="20"/>
-          <w:szCs w:val="20"/>
-          <w:lang w:val="es-GT"/>
-        </w:rPr>
-        <w:t xml:space="preserve"> no disponible</w:t>
+          <w:lang w:val="es-GT"/>
+        </w:rPr>
+        <w:t>FA02: Portal de inicio no disponible</w:t>
       </w:r>
     </w:p>
     <w:p>
@@ -1735,20 +1545,14 @@
         </w:numPr>
         <w:jc w:val="both"/>
         <w:rPr>
-          <w:rFonts w:ascii="Arial" w:hAnsi="Arial" w:cs="Arial"/>
           <w:iCs/>
           <w:noProof/>
-          <w:sz w:val="20"/>
-          <w:szCs w:val="20"/>
-          <w:lang w:val="es-GT"/>
-        </w:rPr>
-      </w:pPr>
-      <w:r>
-        <w:rPr>
-          <w:rFonts w:ascii="Arial" w:hAnsi="Arial" w:cs="Arial"/>
-          <w:noProof/>
-          <w:sz w:val="20"/>
-          <w:szCs w:val="20"/>
+          <w:lang w:val="es-GT"/>
+        </w:rPr>
+      </w:pPr>
+      <w:r>
+        <w:rPr>
+          <w:noProof/>
           <w:lang w:val="es-GT"/>
         </w:rPr>
         <w:t>El sistema muestra un mensaje indicando que el servicio no está disponible. AN02 No. 5</w:t>
@@ -1763,19 +1567,13 @@
         </w:numPr>
         <w:jc w:val="both"/>
         <w:rPr>
-          <w:rFonts w:ascii="Arial" w:hAnsi="Arial" w:cs="Arial"/>
-          <w:noProof/>
-          <w:sz w:val="20"/>
-          <w:szCs w:val="20"/>
-          <w:lang w:val="es-GT"/>
-        </w:rPr>
-      </w:pPr>
-      <w:r>
-        <w:rPr>
-          <w:rFonts w:ascii="Arial" w:hAnsi="Arial" w:cs="Arial"/>
-          <w:noProof/>
-          <w:sz w:val="20"/>
-          <w:szCs w:val="20"/>
+          <w:noProof/>
+          <w:lang w:val="es-GT"/>
+        </w:rPr>
+      </w:pPr>
+      <w:r>
+        <w:rPr>
+          <w:noProof/>
           <w:lang w:val="es-GT"/>
         </w:rPr>
         <w:t>Fin del caso de uso</w:t>
@@ -1787,10 +1585,7 @@
         <w:ind w:left="1080"/>
         <w:jc w:val="both"/>
         <w:rPr>
-          <w:rFonts w:ascii="Arial" w:hAnsi="Arial" w:cs="Arial"/>
-          <w:noProof/>
-          <w:sz w:val="20"/>
-          <w:szCs w:val="20"/>
+          <w:noProof/>
           <w:lang w:val="es-GT"/>
         </w:rPr>
       </w:pPr>
@@ -1801,23 +1596,17 @@
         <w:ind w:left="360"/>
         <w:jc w:val="both"/>
         <w:rPr>
-          <w:rFonts w:ascii="Arial" w:hAnsi="Arial" w:cs="Arial"/>
           <w:b/>
           <w:bCs/>
           <w:noProof/>
-          <w:sz w:val="20"/>
-          <w:szCs w:val="20"/>
-          <w:lang w:val="es-GT"/>
-        </w:rPr>
-      </w:pPr>
-      <w:r>
-        <w:rPr>
-          <w:rFonts w:ascii="Arial" w:hAnsi="Arial" w:cs="Arial"/>
+          <w:lang w:val="es-GT"/>
+        </w:rPr>
+      </w:pPr>
+      <w:r>
+        <w:rPr>
           <w:b/>
           <w:bCs/>
           <w:noProof/>
-          <w:sz w:val="20"/>
-          <w:szCs w:val="20"/>
           <w:lang w:val="es-GT"/>
         </w:rPr>
         <w:t>FA03: El ciudadano Consulta el Estado del caso</w:t>
@@ -1832,19 +1621,13 @@
         </w:numPr>
         <w:jc w:val="both"/>
         <w:rPr>
-          <w:rFonts w:ascii="Arial" w:hAnsi="Arial" w:cs="Arial"/>
-          <w:noProof/>
-          <w:sz w:val="20"/>
-          <w:szCs w:val="20"/>
-          <w:lang w:val="es-GT"/>
-        </w:rPr>
-      </w:pPr>
-      <w:r>
-        <w:rPr>
-          <w:rFonts w:ascii="Arial" w:hAnsi="Arial" w:cs="Arial"/>
-          <w:noProof/>
-          <w:sz w:val="20"/>
-          <w:szCs w:val="20"/>
+          <w:noProof/>
+          <w:lang w:val="es-GT"/>
+        </w:rPr>
+      </w:pPr>
+      <w:r>
+        <w:rPr>
+          <w:noProof/>
           <w:lang w:val="es-GT"/>
         </w:rPr>
         <w:t xml:space="preserve">El sistema muestra el botón “consultar estado del caso”  </w:t>
@@ -1859,22 +1642,15 @@
         </w:numPr>
         <w:jc w:val="both"/>
         <w:rPr>
-          <w:rFonts w:ascii="Arial" w:hAnsi="Arial" w:cs="Arial"/>
-          <w:noProof/>
-          <w:sz w:val="20"/>
-          <w:szCs w:val="20"/>
-          <w:lang w:val="es-GT"/>
-        </w:rPr>
-      </w:pPr>
-      <w:r>
-        <w:rPr>
-          <w:rFonts w:ascii="Arial" w:hAnsi="Arial" w:cs="Arial"/>
-          <w:noProof/>
-          <w:sz w:val="20"/>
-          <w:szCs w:val="20"/>
-          <w:lang w:val="es-GT"/>
-        </w:rPr>
-        <w:lastRenderedPageBreak/>
+          <w:noProof/>
+          <w:lang w:val="es-GT"/>
+        </w:rPr>
+      </w:pPr>
+      <w:r>
+        <w:rPr>
+          <w:noProof/>
+          <w:lang w:val="es-GT"/>
+        </w:rPr>
         <w:t>El ciudadano selecciona el botón “consultar estado del caso” CU-02</w:t>
       </w:r>
     </w:p>
@@ -1887,19 +1663,13 @@
         </w:numPr>
         <w:jc w:val="both"/>
         <w:rPr>
-          <w:rFonts w:ascii="Arial" w:hAnsi="Arial" w:cs="Arial"/>
-          <w:noProof/>
-          <w:sz w:val="20"/>
-          <w:szCs w:val="20"/>
-          <w:lang w:val="es-GT"/>
-        </w:rPr>
-      </w:pPr>
-      <w:r>
-        <w:rPr>
-          <w:rFonts w:ascii="Arial" w:hAnsi="Arial" w:cs="Arial"/>
-          <w:noProof/>
-          <w:sz w:val="20"/>
-          <w:szCs w:val="20"/>
+          <w:noProof/>
+          <w:lang w:val="es-GT"/>
+        </w:rPr>
+      </w:pPr>
+      <w:r>
+        <w:rPr>
+          <w:noProof/>
           <w:lang w:val="es-GT"/>
         </w:rPr>
         <w:t>Fin del caso de uso</w:t>
@@ -1911,10 +1681,7 @@
         <w:ind w:left="1440"/>
         <w:jc w:val="both"/>
         <w:rPr>
-          <w:rFonts w:ascii="Arial" w:hAnsi="Arial" w:cs="Arial"/>
-          <w:noProof/>
-          <w:sz w:val="20"/>
-          <w:szCs w:val="20"/>
+          <w:noProof/>
           <w:lang w:val="es-GT"/>
         </w:rPr>
       </w:pPr>
@@ -1924,36 +1691,212 @@
         <w:pStyle w:val="BodyText"/>
         <w:jc w:val="both"/>
         <w:rPr>
-          <w:rFonts w:ascii="Arial" w:hAnsi="Arial" w:cs="Arial"/>
           <w:b/>
           <w:bCs/>
           <w:noProof/>
-          <w:sz w:val="20"/>
-          <w:szCs w:val="20"/>
-          <w:lang w:val="es-GT"/>
-        </w:rPr>
-      </w:pPr>
-      <w:r>
-        <w:rPr>
-          <w:rFonts w:ascii="Arial" w:hAnsi="Arial" w:cs="Arial"/>
-          <w:noProof/>
-          <w:sz w:val="20"/>
-          <w:szCs w:val="20"/>
-          <w:lang w:val="es-GT"/>
-        </w:rPr>
-        <w:t xml:space="preserve">       </w:t>
-      </w:r>
-      <w:r>
-        <w:rPr>
-          <w:rFonts w:ascii="Arial" w:hAnsi="Arial" w:cs="Arial"/>
+          <w:lang w:val="es-GT"/>
+        </w:rPr>
+      </w:pPr>
+      <w:r>
+        <w:rPr>
+          <w:noProof/>
+          <w:lang w:val="es-GT"/>
+        </w:rPr>
+        <w:t xml:space="preserve">      </w:t>
+      </w:r>
+      <w:r>
+        <w:rPr>
           <w:b/>
           <w:bCs/>
           <w:noProof/>
-          <w:sz w:val="20"/>
-          <w:szCs w:val="20"/>
-          <w:lang w:val="es-GT"/>
-        </w:rPr>
-        <w:t>FA04: Inicio de sesión</w:t>
+          <w:lang w:val="es-GT"/>
+        </w:rPr>
+        <w:t>FA0</w:t>
+      </w:r>
+      <w:r>
+        <w:rPr>
+          <w:b/>
+          <w:bCs/>
+          <w:noProof/>
+          <w:lang w:val="es-GT"/>
+        </w:rPr>
+        <w:t>4</w:t>
+      </w:r>
+      <w:r>
+        <w:rPr>
+          <w:b/>
+          <w:bCs/>
+          <w:noProof/>
+          <w:lang w:val="es-GT"/>
+        </w:rPr>
+        <w:t xml:space="preserve">: El ciudadano </w:t>
+      </w:r>
+      <w:r>
+        <w:rPr>
+          <w:b/>
+          <w:bCs/>
+          <w:noProof/>
+          <w:lang w:val="es-GT"/>
+        </w:rPr>
+        <w:t>Modifica la queja ingresada</w:t>
+      </w:r>
+    </w:p>
+    <w:p>
+      <w:pPr>
+        <w:pStyle w:val="BodyText"/>
+        <w:numPr>
+          <w:ilvl w:val="0"/>
+          <w:numId w:val="7"/>
+        </w:numPr>
+        <w:ind w:left="1080"/>
+        <w:jc w:val="both"/>
+        <w:rPr>
+          <w:noProof/>
+          <w:lang w:val="es-GT"/>
+        </w:rPr>
+      </w:pPr>
+      <w:r>
+        <w:rPr>
+          <w:noProof/>
+          <w:lang w:val="es-GT"/>
+        </w:rPr>
+        <w:t>El sistema muestra el botón “</w:t>
+      </w:r>
+      <w:r>
+        <w:rPr>
+          <w:noProof/>
+          <w:lang w:val="es-GT"/>
+        </w:rPr>
+        <w:t>Modificar Queja</w:t>
+      </w:r>
+      <w:r>
+        <w:rPr>
+          <w:noProof/>
+          <w:lang w:val="es-GT"/>
+        </w:rPr>
+        <w:t xml:space="preserve">”  </w:t>
+      </w:r>
+    </w:p>
+    <w:p>
+      <w:pPr>
+        <w:pStyle w:val="BodyText"/>
+        <w:numPr>
+          <w:ilvl w:val="0"/>
+          <w:numId w:val="7"/>
+        </w:numPr>
+        <w:ind w:left="1080"/>
+        <w:jc w:val="both"/>
+        <w:rPr>
+          <w:noProof/>
+          <w:lang w:val="es-GT"/>
+        </w:rPr>
+      </w:pPr>
+      <w:r>
+        <w:rPr>
+          <w:noProof/>
+          <w:lang w:val="es-GT"/>
+        </w:rPr>
+        <w:t>El ciudadano selecciona el botón “</w:t>
+      </w:r>
+      <w:r>
+        <w:rPr>
+          <w:noProof/>
+          <w:lang w:val="es-GT"/>
+        </w:rPr>
+        <w:t>Modificar Queja</w:t>
+      </w:r>
+      <w:r>
+        <w:rPr>
+          <w:noProof/>
+          <w:lang w:val="es-GT"/>
+        </w:rPr>
+        <w:t>” CU-</w:t>
+      </w:r>
+      <w:r>
+        <w:rPr>
+          <w:noProof/>
+          <w:lang w:val="es-GT"/>
+        </w:rPr>
+        <w:t>18</w:t>
+      </w:r>
+    </w:p>
+    <w:p>
+      <w:pPr>
+        <w:pStyle w:val="BodyText"/>
+        <w:numPr>
+          <w:ilvl w:val="0"/>
+          <w:numId w:val="7"/>
+        </w:numPr>
+        <w:ind w:left="1080"/>
+        <w:jc w:val="both"/>
+        <w:rPr>
+          <w:noProof/>
+          <w:lang w:val="es-GT"/>
+        </w:rPr>
+      </w:pPr>
+      <w:r>
+        <w:rPr>
+          <w:noProof/>
+          <w:lang w:val="es-GT"/>
+        </w:rPr>
+        <w:t>Fin del caso de uso</w:t>
+      </w:r>
+    </w:p>
+    <w:p>
+      <w:pPr>
+        <w:pStyle w:val="BodyText"/>
+        <w:ind w:left="-360"/>
+        <w:jc w:val="both"/>
+        <w:rPr>
+          <w:noProof/>
+          <w:lang w:val="es-GT"/>
+        </w:rPr>
+      </w:pPr>
+    </w:p>
+    <w:p>
+      <w:pPr>
+        <w:pStyle w:val="BodyText"/>
+        <w:jc w:val="both"/>
+        <w:rPr>
+          <w:b/>
+          <w:bCs/>
+          <w:noProof/>
+          <w:lang w:val="es-GT"/>
+        </w:rPr>
+      </w:pPr>
+      <w:r>
+        <w:rPr>
+          <w:noProof/>
+          <w:lang w:val="es-GT"/>
+        </w:rPr>
+        <w:t xml:space="preserve">       </w:t>
+      </w:r>
+      <w:r>
+        <w:rPr>
+          <w:b/>
+          <w:bCs/>
+          <w:noProof/>
+          <w:lang w:val="es-GT"/>
+        </w:rPr>
+        <w:t>FA0</w:t>
+      </w:r>
+      <w:r>
+        <w:rPr>
+          <w:b/>
+          <w:bCs/>
+          <w:noProof/>
+          <w:lang w:val="es-GT"/>
+        </w:rPr>
+        <w:t>5</w:t>
+      </w:r>
+      <w:r>
+        <w:rPr>
+          <w:b/>
+          <w:bCs/>
+          <w:noProof/>
+          <w:lang w:val="es-GT"/>
+        </w:rPr>
+        <w:t>: Inicio de sesión</w:t>
       </w:r>
     </w:p>
     <w:p>
@@ -1965,19 +1908,13 @@
         </w:numPr>
         <w:jc w:val="both"/>
         <w:rPr>
-          <w:rFonts w:ascii="Arial" w:hAnsi="Arial" w:cs="Arial"/>
-          <w:noProof/>
-          <w:sz w:val="20"/>
-          <w:szCs w:val="20"/>
-          <w:lang w:val="es-GT"/>
-        </w:rPr>
-      </w:pPr>
-      <w:r>
-        <w:rPr>
-          <w:rFonts w:ascii="Arial" w:hAnsi="Arial" w:cs="Arial"/>
-          <w:noProof/>
-          <w:sz w:val="20"/>
-          <w:szCs w:val="20"/>
+          <w:noProof/>
+          <w:lang w:val="es-GT"/>
+        </w:rPr>
+      </w:pPr>
+      <w:r>
+        <w:rPr>
+          <w:noProof/>
           <w:lang w:val="es-GT"/>
         </w:rPr>
         <w:t>El sistema muestra el botón “Iniciar Sesión”</w:t>
@@ -1992,19 +1929,13 @@
         </w:numPr>
         <w:jc w:val="both"/>
         <w:rPr>
-          <w:rFonts w:ascii="Arial" w:hAnsi="Arial" w:cs="Arial"/>
-          <w:noProof/>
-          <w:sz w:val="20"/>
-          <w:szCs w:val="20"/>
-          <w:lang w:val="es-GT"/>
-        </w:rPr>
-      </w:pPr>
-      <w:r>
-        <w:rPr>
-          <w:rFonts w:ascii="Arial" w:hAnsi="Arial" w:cs="Arial"/>
-          <w:noProof/>
-          <w:sz w:val="20"/>
-          <w:szCs w:val="20"/>
+          <w:noProof/>
+          <w:lang w:val="es-GT"/>
+        </w:rPr>
+      </w:pPr>
+      <w:r>
+        <w:rPr>
+          <w:noProof/>
           <w:lang w:val="es-GT"/>
         </w:rPr>
         <w:t>El empleado municipal selecciona el botón “Iniciar sesión” CU-01</w:t>
@@ -2019,19 +1950,13 @@
         </w:numPr>
         <w:jc w:val="both"/>
         <w:rPr>
-          <w:rFonts w:ascii="Arial" w:hAnsi="Arial" w:cs="Arial"/>
-          <w:noProof/>
-          <w:sz w:val="20"/>
-          <w:szCs w:val="20"/>
-          <w:lang w:val="es-GT"/>
-        </w:rPr>
-      </w:pPr>
-      <w:r>
-        <w:rPr>
-          <w:rFonts w:ascii="Arial" w:hAnsi="Arial" w:cs="Arial"/>
-          <w:noProof/>
-          <w:sz w:val="20"/>
-          <w:szCs w:val="20"/>
+          <w:noProof/>
+          <w:lang w:val="es-GT"/>
+        </w:rPr>
+      </w:pPr>
+      <w:r>
+        <w:rPr>
+          <w:noProof/>
           <w:lang w:val="es-GT"/>
         </w:rPr>
         <w:t>Fin del caso de uso</w:t>
@@ -2042,10 +1967,7 @@
         <w:pStyle w:val="BodyText"/>
         <w:jc w:val="both"/>
         <w:rPr>
-          <w:rFonts w:ascii="Arial" w:hAnsi="Arial" w:cs="Arial"/>
-          <w:noProof/>
-          <w:sz w:val="20"/>
-          <w:szCs w:val="20"/>
+          <w:noProof/>
           <w:lang w:val="es-GT"/>
         </w:rPr>
       </w:pPr>
@@ -2060,21 +1982,15 @@
         <w:spacing w:line="360" w:lineRule="auto"/>
         <w:ind w:right="300"/>
         <w:rPr>
-          <w:rFonts w:ascii="Arial" w:hAnsi="Arial" w:cs="Arial"/>
           <w:b/>
           <w:bCs/>
-          <w:sz w:val="27"/>
-          <w:szCs w:val="27"/>
           <w:lang w:val="es-ES_tradnl"/>
         </w:rPr>
       </w:pPr>
       <w:r>
         <w:rPr>
-          <w:rFonts w:ascii="Arial" w:hAnsi="Arial" w:cs="Arial"/>
           <w:b/>
           <w:bCs/>
-          <w:sz w:val="27"/>
-          <w:szCs w:val="27"/>
         </w:rPr>
         <w:t>Postcondiciones.</w:t>
       </w:r>
@@ -2089,18 +2005,12 @@
         <w:spacing w:line="360" w:lineRule="auto"/>
         <w:ind w:left="1225" w:hanging="505"/>
         <w:rPr>
-          <w:rFonts w:ascii="Arial" w:hAnsi="Arial" w:cs="Arial"/>
-          <w:noProof/>
-          <w:sz w:val="20"/>
-          <w:szCs w:val="20"/>
-        </w:rPr>
-      </w:pPr>
-      <w:r>
-        <w:rPr>
-          <w:rFonts w:ascii="Arial" w:hAnsi="Arial" w:cs="Arial"/>
-          <w:noProof/>
-          <w:sz w:val="20"/>
-          <w:szCs w:val="20"/>
+          <w:noProof/>
+        </w:rPr>
+      </w:pPr>
+      <w:r>
+        <w:rPr>
+          <w:noProof/>
         </w:rPr>
         <w:t xml:space="preserve"> El empleado municipal puede autenticarse para ingresar al sistema.</w:t>
       </w:r>
@@ -2115,21 +2025,15 @@
         <w:spacing w:line="360" w:lineRule="auto"/>
         <w:ind w:right="300"/>
         <w:rPr>
-          <w:rFonts w:ascii="Arial" w:hAnsi="Arial" w:cs="Arial"/>
           <w:b/>
           <w:bCs/>
-          <w:sz w:val="27"/>
-          <w:szCs w:val="27"/>
           <w:lang w:val="es-ES_tradnl"/>
         </w:rPr>
       </w:pPr>
       <w:r>
         <w:rPr>
-          <w:rFonts w:ascii="Arial" w:hAnsi="Arial" w:cs="Arial"/>
           <w:b/>
           <w:bCs/>
-          <w:sz w:val="27"/>
-          <w:szCs w:val="27"/>
           <w:lang w:val="es-ES_tradnl"/>
         </w:rPr>
         <w:t>Requerimientos Suplementarios o no Funcionales</w:t>
@@ -2144,20 +2048,14 @@
         </w:numPr>
         <w:spacing w:line="360" w:lineRule="auto"/>
         <w:rPr>
-          <w:rFonts w:ascii="Arial" w:hAnsi="Arial" w:cs="Arial"/>
           <w:iCs/>
           <w:noProof/>
-          <w:sz w:val="20"/>
-          <w:szCs w:val="20"/>
           <w:lang w:val="es-ES_tradnl"/>
         </w:rPr>
       </w:pPr>
       <w:r>
         <w:rPr>
-          <w:rFonts w:ascii="Arial" w:hAnsi="Arial" w:cs="Arial"/>
-          <w:noProof/>
-          <w:sz w:val="20"/>
-          <w:szCs w:val="20"/>
+          <w:noProof/>
         </w:rPr>
         <w:t>El formulario de autenticación deberá utilizar conexión segura HTTPS.</w:t>
       </w:r>
@@ -2171,21 +2069,15 @@
         </w:numPr>
         <w:spacing w:line="360" w:lineRule="auto"/>
         <w:rPr>
-          <w:rFonts w:ascii="Arial" w:hAnsi="Arial" w:cs="Arial"/>
           <w:iCs/>
           <w:noProof/>
-          <w:sz w:val="20"/>
-          <w:szCs w:val="20"/>
           <w:lang w:val="es-ES_tradnl"/>
         </w:rPr>
       </w:pPr>
       <w:r>
         <w:rPr>
-          <w:rFonts w:ascii="Arial" w:hAnsi="Arial" w:cs="Arial"/>
           <w:iCs/>
           <w:noProof/>
-          <w:sz w:val="20"/>
-          <w:szCs w:val="20"/>
           <w:lang w:val="es-ES_tradnl"/>
         </w:rPr>
         <w:t>El sistema deberá estar disponible las 24 horas del día, excepto durante mantenimientos programados.</w:t>
@@ -2201,21 +2093,15 @@
         <w:spacing w:line="360" w:lineRule="auto"/>
         <w:ind w:right="300"/>
         <w:rPr>
-          <w:rFonts w:ascii="Arial" w:hAnsi="Arial" w:cs="Arial"/>
           <w:b/>
           <w:bCs/>
-          <w:sz w:val="27"/>
-          <w:szCs w:val="27"/>
           <w:lang w:val="es-ES_tradnl"/>
         </w:rPr>
       </w:pPr>
       <w:r>
         <w:rPr>
-          <w:rFonts w:ascii="Arial" w:hAnsi="Arial" w:cs="Arial"/>
           <w:b/>
           <w:bCs/>
-          <w:sz w:val="27"/>
-          <w:szCs w:val="27"/>
           <w:lang w:val="es-ES_tradnl"/>
         </w:rPr>
         <w:t>Firmas Necesarias</w:t>
@@ -2266,20 +2152,16 @@
             </w:pPr>
             <w:r>
               <w:rPr>
-                <w:rFonts w:ascii="Arial" w:hAnsi="Arial" w:cs="Arial"/>
                 <w:lang w:val="es-ES_tradnl"/>
               </w:rPr>
               <w:t> </w:t>
             </w:r>
             <w:r>
               <w:rPr>
-                <w:rFonts w:ascii="Arial" w:hAnsi="Arial" w:cs="Arial"/>
                 <w:b/>
                 <w:bCs/>
                 <w:i/>
                 <w:iCs/>
-                <w:sz w:val="20"/>
-                <w:szCs w:val="20"/>
               </w:rPr>
               <w:t>Persona</w:t>
             </w:r>
@@ -2302,13 +2184,10 @@
             </w:pPr>
             <w:r>
               <w:rPr>
-                <w:rFonts w:ascii="Arial" w:hAnsi="Arial" w:cs="Arial"/>
                 <w:b/>
                 <w:bCs/>
                 <w:i/>
                 <w:iCs/>
-                <w:sz w:val="20"/>
-                <w:szCs w:val="20"/>
               </w:rPr>
               <w:t>Sector</w:t>
             </w:r>
@@ -2331,13 +2210,10 @@
             </w:pPr>
             <w:r>
               <w:rPr>
-                <w:rFonts w:ascii="Arial" w:hAnsi="Arial" w:cs="Arial"/>
                 <w:b/>
                 <w:bCs/>
                 <w:i/>
                 <w:iCs/>
-                <w:sz w:val="20"/>
-                <w:szCs w:val="20"/>
               </w:rPr>
               <w:t>Firma</w:t>
             </w:r>
@@ -2363,10 +2239,7 @@
           </w:tcPr>
           <w:p>
             <w:r>
-              <w:t> </w:t>
-            </w:r>
-            <w:r>
-              <w:t>Edy Rigoberto Ramírez</w:t>
+              <w:t> Edy Rigoberto Ramírez</w:t>
             </w:r>
           </w:p>
         </w:tc>
@@ -2471,9 +2344,9 @@
         <w:spacing w:line="360" w:lineRule="auto"/>
         <w:ind w:right="300"/>
         <w:rPr>
-          <w:rFonts w:ascii="Arial" w:hAnsi="Arial" w:cs="Arial"/>
-          <w:sz w:val="20"/>
-          <w:szCs w:val="20"/>
+          <w:rFonts w:ascii="Times New Roman" w:hAnsi="Times New Roman" w:cs="Times New Roman"/>
+          <w:sz w:val="24"/>
+          <w:szCs w:val="24"/>
           <w:lang w:val="es-ES_tradnl"/>
         </w:rPr>
       </w:pPr>
@@ -2867,6 +2740,92 @@
     </w:lvl>
   </w:abstractNum>
   <w:abstractNum w:abstractNumId="4" w15:restartNumberingAfterBreak="0">
+    <w:nsid w:val="4A8B6889"/>
+    <w:multiLevelType w:val="hybridMultilevel"/>
+    <w:tmpl w:val="5074E48E"/>
+    <w:lvl w:ilvl="0" w:tplc="CD027AC6">
+      <w:start w:val="1"/>
+      <w:numFmt w:val="decimal"/>
+      <w:lvlText w:val="%1."/>
+      <w:lvlJc w:val="left"/>
+      <w:pPr>
+        <w:ind w:left="1440" w:hanging="360"/>
+      </w:pPr>
+    </w:lvl>
+    <w:lvl w:ilvl="1" w:tplc="8452C8F2">
+      <w:start w:val="1"/>
+      <w:numFmt w:val="lowerLetter"/>
+      <w:lvlText w:val="%2."/>
+      <w:lvlJc w:val="left"/>
+      <w:pPr>
+        <w:ind w:left="2160" w:hanging="360"/>
+      </w:pPr>
+    </w:lvl>
+    <w:lvl w:ilvl="2" w:tplc="837CC2BE">
+      <w:start w:val="1"/>
+      <w:numFmt w:val="lowerRoman"/>
+      <w:lvlText w:val="%3."/>
+      <w:lvlJc w:val="right"/>
+      <w:pPr>
+        <w:ind w:left="2880" w:hanging="180"/>
+      </w:pPr>
+    </w:lvl>
+    <w:lvl w:ilvl="3" w:tplc="8CA625A4">
+      <w:start w:val="1"/>
+      <w:numFmt w:val="decimal"/>
+      <w:lvlText w:val="%4."/>
+      <w:lvlJc w:val="left"/>
+      <w:pPr>
+        <w:ind w:left="3600" w:hanging="360"/>
+      </w:pPr>
+    </w:lvl>
+    <w:lvl w:ilvl="4" w:tplc="9170EBC0">
+      <w:start w:val="1"/>
+      <w:numFmt w:val="lowerLetter"/>
+      <w:lvlText w:val="%5."/>
+      <w:lvlJc w:val="left"/>
+      <w:pPr>
+        <w:ind w:left="4320" w:hanging="360"/>
+      </w:pPr>
+    </w:lvl>
+    <w:lvl w:ilvl="5" w:tplc="EA601A5E">
+      <w:start w:val="1"/>
+      <w:numFmt w:val="lowerRoman"/>
+      <w:lvlText w:val="%6."/>
+      <w:lvlJc w:val="right"/>
+      <w:pPr>
+        <w:ind w:left="5040" w:hanging="180"/>
+      </w:pPr>
+    </w:lvl>
+    <w:lvl w:ilvl="6" w:tplc="C6E6DC02">
+      <w:start w:val="1"/>
+      <w:numFmt w:val="decimal"/>
+      <w:lvlText w:val="%7."/>
+      <w:lvlJc w:val="left"/>
+      <w:pPr>
+        <w:ind w:left="5760" w:hanging="360"/>
+      </w:pPr>
+    </w:lvl>
+    <w:lvl w:ilvl="7" w:tplc="E1007160">
+      <w:start w:val="1"/>
+      <w:numFmt w:val="lowerLetter"/>
+      <w:lvlText w:val="%8."/>
+      <w:lvlJc w:val="left"/>
+      <w:pPr>
+        <w:ind w:left="6480" w:hanging="360"/>
+      </w:pPr>
+    </w:lvl>
+    <w:lvl w:ilvl="8" w:tplc="E56AA3A6">
+      <w:start w:val="1"/>
+      <w:numFmt w:val="lowerRoman"/>
+      <w:lvlText w:val="%9."/>
+      <w:lvlJc w:val="right"/>
+      <w:pPr>
+        <w:ind w:left="7200" w:hanging="180"/>
+      </w:pPr>
+    </w:lvl>
+  </w:abstractNum>
+  <w:abstractNum w:abstractNumId="5" w15:restartNumberingAfterBreak="0">
     <w:nsid w:val="6A4361E2"/>
     <w:multiLevelType w:val="hybridMultilevel"/>
     <w:tmpl w:val="DB24ABE0"/>
@@ -2952,7 +2911,7 @@
       </w:pPr>
     </w:lvl>
   </w:abstractNum>
-  <w:abstractNum w:abstractNumId="5" w15:restartNumberingAfterBreak="0">
+  <w:abstractNum w:abstractNumId="6" w15:restartNumberingAfterBreak="0">
     <w:nsid w:val="7C2BDBAE"/>
     <w:multiLevelType w:val="hybridMultilevel"/>
     <w:tmpl w:val="5074E48E"/>
@@ -3042,7 +3001,7 @@
     <w:abstractNumId w:val="1"/>
   </w:num>
   <w:num w:numId="2">
-    <w:abstractNumId w:val="5"/>
+    <w:abstractNumId w:val="6"/>
   </w:num>
   <w:num w:numId="3">
     <w:abstractNumId w:val="0"/>
@@ -3051,10 +3010,13 @@
     <w:abstractNumId w:val="3"/>
   </w:num>
   <w:num w:numId="5">
-    <w:abstractNumId w:val="4"/>
+    <w:abstractNumId w:val="5"/>
   </w:num>
   <w:num w:numId="6">
     <w:abstractNumId w:val="2"/>
+  </w:num>
+  <w:num w:numId="7">
+    <w:abstractNumId w:val="4"/>
   </w:num>
 </w:numbering>
 </file>

</xml_diff>